<commit_message>
refactor: rename labs to activities
</commit_message>
<xml_diff>
--- a/courseware/LG-Strategic Mergers and Acquisitions.docx
+++ b/courseware/LG-Strategic Mergers and Acquisitions.docx
@@ -450,7 +450,7 @@
           <w:color w:val="333333"/>
           <w:sz w:val="22"/>
         </w:rPr>
-        <w:t>Activity 1 — Bonadio–TGA Deal Thesis and Structure Lab</w:t>
+        <w:t>Activity 1 — Bonadio–TGA Deal Thesis and Structure Activity</w:t>
         <w:tab/>
         <w:t>9</w:t>
       </w:r>
@@ -469,7 +469,7 @@
           <w:color w:val="333333"/>
           <w:sz w:val="22"/>
         </w:rPr>
-        <w:t>Activity 2 — Bonadio–TGA Valuation Triangulation Lab</w:t>
+        <w:t>Activity 2 — Bonadio–TGA Valuation Triangulation Activity</w:t>
         <w:tab/>
         <w:t>12</w:t>
       </w:r>
@@ -507,7 +507,7 @@
           <w:color w:val="333333"/>
           <w:sz w:val="22"/>
         </w:rPr>
-        <w:t>Activity 3 — Bonadio–TGA Three-Year Synergy Forecast Lab</w:t>
+        <w:t>Activity 3 — Bonadio–TGA Three-Year Synergy Forecast Activity</w:t>
         <w:tab/>
         <w:t>18</w:t>
       </w:r>
@@ -526,7 +526,7 @@
           <w:color w:val="333333"/>
           <w:sz w:val="22"/>
         </w:rPr>
-        <w:t>Activity 4 — Bonadio–TGA Pro Forma and Tax Challenge Lab</w:t>
+        <w:t>Activity 4 — Bonadio–TGA Pro Forma and Tax Challenge Activity</w:t>
         <w:tab/>
         <w:t>21</w:t>
       </w:r>
@@ -564,7 +564,7 @@
           <w:color w:val="333333"/>
           <w:sz w:val="22"/>
         </w:rPr>
-        <w:t>Activity 5 — Bonadio–TGA Target Screening and Diligence Lab</w:t>
+        <w:t>Activity 5 — Bonadio–TGA Target Screening and Diligence Activity</w:t>
         <w:tab/>
         <w:t>27</w:t>
       </w:r>
@@ -583,7 +583,7 @@
           <w:color w:val="333333"/>
           <w:sz w:val="22"/>
         </w:rPr>
-        <w:t>Activity 6 — Bonadio–TGA M&amp;A Risk Intelligence Lab</w:t>
+        <w:t>Activity 6 — Bonadio–TGA M&amp;A Risk Intelligence Activity</w:t>
         <w:tab/>
         <w:t>30</w:t>
       </w:r>
@@ -621,7 +621,7 @@
           <w:color w:val="333333"/>
           <w:sz w:val="22"/>
         </w:rPr>
-        <w:t>Activity 7 — Bonadio–TGA Integration Program Design Lab</w:t>
+        <w:t>Activity 7 — Bonadio–TGA Integration Program Design Activity</w:t>
         <w:tab/>
         <w:t>36</w:t>
       </w:r>
@@ -640,7 +640,7 @@
           <w:color w:val="333333"/>
           <w:sz w:val="22"/>
         </w:rPr>
-        <w:t>Activity 8 — Bonadio–TGA Culture, Talent and Client Continuity Lab</w:t>
+        <w:t>Activity 8 — Bonadio–TGA Culture, Talent and Client Continuity Activity</w:t>
         <w:tab/>
         <w:t>39</w:t>
       </w:r>
@@ -1692,7 +1692,7 @@
         <w:pStyle w:val="Heading1"/>
       </w:pPr>
       <w:r>
-        <w:t>Activity 1 — Bonadio–TGA Deal Thesis and Structure Lab</w:t>
+        <w:t>Activity 1 — Bonadio–TGA Deal Thesis and Structure Activity</w:t>
       </w:r>
     </w:p>
     <w:p>
@@ -2283,7 +2283,7 @@
         <w:pStyle w:val="Heading1"/>
       </w:pPr>
       <w:r>
-        <w:t>Activity 2 — Bonadio–TGA Valuation Triangulation Lab</w:t>
+        <w:t>Activity 2 — Bonadio–TGA Valuation Triangulation Activity</w:t>
       </w:r>
     </w:p>
     <w:p>
@@ -3665,7 +3665,7 @@
         <w:pStyle w:val="Heading1"/>
       </w:pPr>
       <w:r>
-        <w:t>Activity 3 — Bonadio–TGA Three-Year Synergy Forecast Lab</w:t>
+        <w:t>Activity 3 — Bonadio–TGA Three-Year Synergy Forecast Activity</w:t>
       </w:r>
     </w:p>
     <w:p>
@@ -4309,7 +4309,7 @@
         <w:pStyle w:val="Heading1"/>
       </w:pPr>
       <w:r>
-        <w:t>Activity 4 — Bonadio–TGA Pro Forma and Tax Challenge Lab</w:t>
+        <w:t>Activity 4 — Bonadio–TGA Pro Forma and Tax Challenge Activity</w:t>
       </w:r>
     </w:p>
     <w:p>
@@ -5667,7 +5667,7 @@
         <w:pStyle w:val="Heading1"/>
       </w:pPr>
       <w:r>
-        <w:t>Activity 5 — Bonadio–TGA Target Screening and Diligence Lab</w:t>
+        <w:t>Activity 5 — Bonadio–TGA Target Screening and Diligence Activity</w:t>
       </w:r>
     </w:p>
     <w:p>
@@ -6348,7 +6348,7 @@
         <w:pStyle w:val="Heading1"/>
       </w:pPr>
       <w:r>
-        <w:t>Activity 6 — Bonadio–TGA M&amp;A Risk Intelligence Lab</w:t>
+        <w:t>Activity 6 — Bonadio–TGA M&amp;A Risk Intelligence Activity</w:t>
       </w:r>
     </w:p>
     <w:p>
@@ -7751,7 +7751,7 @@
         <w:pStyle w:val="Heading1"/>
       </w:pPr>
       <w:r>
-        <w:t>Activity 7 — Bonadio–TGA Integration Program Design Lab</w:t>
+        <w:t>Activity 7 — Bonadio–TGA Integration Program Design Activity</w:t>
       </w:r>
     </w:p>
     <w:p>
@@ -8432,7 +8432,7 @@
         <w:pStyle w:val="Heading1"/>
       </w:pPr>
       <w:r>
-        <w:t>Activity 8 — Bonadio–TGA Culture, Talent and Client Continuity Lab</w:t>
+        <w:t>Activity 8 — Bonadio–TGA Culture, Talent and Client Continuity Activity</w:t>
       </w:r>
     </w:p>
     <w:p>

</xml_diff>